<commit_message>
Add matching four-question GROW W3A arrivals and separate staff answers
</commit_message>
<xml_diff>
--- a/Science_Teesside/Teaching_Packs/GROW/lessons/W3A/GROW_W3A_Friction_Pupil.docx
+++ b/Science_Teesside/Teaching_Packs/GROW/lessons/W3A/GROW_W3A_Friction_Pupil.docx
@@ -63,7 +63,7 @@
     </w:p>
     <w:p>
       <w:r>
-        <w:t>Supported: say or point to what you notice. Standard: record what you feel and name the force. Stretch: explain how the movement can warm your hands.</w:t>
+        <w:t>Choose your four-question arrival page: Supported 7, Standard 8 or Stretch 9. Use screen or paper; you do not need to do both.</w:t>
       </w:r>
     </w:p>
     <w:p>
@@ -2685,6 +2685,606 @@
         <w:t>Place cards in three groups below these labels, or point to a label. Give a reason; moving a card alone is not the whole explanation.</w:t>
       </w:r>
     </w:p>
+    <w:p>
+      <w:pPr>
+        <w:pStyle w:val="Kicker"/>
+        <w:pageBreakBefore/>
+      </w:pPr>
+      <w:r>
+        <w:t>ARRIVAL / SUPPORTED</w:t>
+      </w:r>
+    </w:p>
+    <w:p>
+      <w:pPr>
+        <w:pStyle w:val="Title"/>
+      </w:pPr>
+      <w:r>
+        <w:t>Friction arrival</w:t>
+      </w:r>
+    </w:p>
+    <w:p>
+      <w:r>
+        <w:t>Supported · Four minutes within Lesson A</w:t>
+      </w:r>
+    </w:p>
+    <w:p>
+      <w:r>
+        <w:t>Choose one route. Point, say, sign, draw or write. You may pass or say not sure. Use screen or paper; you do not need to do both.</w:t>
+      </w:r>
+    </w:p>
+    <w:p>
+      <w:r>
+        <w:t>For question 3, hand rubbing is optional. If comfortable, gently rub your hands for up to five seconds; stop at discomfort. You can watch an adult or describe a familiar hand-rubbing example instead. Say whether you observed it, remembered it or predicted it.</w:t>
+      </w:r>
+    </w:p>
+    <w:tbl>
+      <w:tblPr>
+        <w:tblW w:type="auto" w:w="0"/>
+        <w:tblLayout w:type="fixed"/>
+        <w:tblLook w:firstColumn="1" w:firstRow="1" w:lastColumn="0" w:lastRow="0" w:noHBand="0" w:noVBand="1" w:val="04A0"/>
+      </w:tblPr>
+      <w:tblGrid>
+        <w:gridCol w:w="4933"/>
+        <w:gridCol w:w="4933"/>
+      </w:tblGrid>
+      <w:tr>
+        <w:tc>
+          <w:tcPr>
+            <w:tcW w:type="dxa" w:w="4933"/>
+            <w:vAlign w:val="top"/>
+            <w:tcBorders>
+              <w:top w:val="single" w:sz="5" w:color="D9D9D9"/>
+              <w:left w:val="single" w:sz="5" w:color="D9D9D9"/>
+              <w:bottom w:val="single" w:sz="5" w:color="D9D9D9"/>
+              <w:right w:val="single" w:sz="5" w:color="D9D9D9"/>
+            </w:tcBorders>
+            <w:tcMar>
+              <w:top w:w="120" w:type="dxa"/>
+              <w:left w:w="120" w:type="dxa"/>
+              <w:bottom w:w="120" w:type="dxa"/>
+              <w:right w:w="120" w:type="dxa"/>
+            </w:tcMar>
+          </w:tcPr>
+          <w:p>
+            <w:pPr>
+              <w:spacing w:after="200"/>
+            </w:pPr>
+            <w:r>
+              <w:rPr>
+                <w:b/>
+              </w:rPr>
+              <w:t>1. A push moves a toy car away. Which action moved it? Push / pull.</w:t>
+            </w:r>
+          </w:p>
+          <w:p>
+            <w:pPr>
+              <w:spacing w:after="1300"/>
+            </w:pPr>
+            <w:r>
+              <w:t xml:space="preserve"> </w:t>
+            </w:r>
+          </w:p>
+        </w:tc>
+        <w:tc>
+          <w:tcPr>
+            <w:tcW w:type="dxa" w:w="4933"/>
+            <w:vAlign w:val="top"/>
+            <w:tcBorders>
+              <w:top w:val="single" w:sz="5" w:color="D9D9D9"/>
+              <w:left w:val="single" w:sz="5" w:color="D9D9D9"/>
+              <w:bottom w:val="single" w:sz="5" w:color="D9D9D9"/>
+              <w:right w:val="single" w:sz="5" w:color="D9D9D9"/>
+            </w:tcBorders>
+            <w:tcMar>
+              <w:top w:w="120" w:type="dxa"/>
+              <w:left w:w="120" w:type="dxa"/>
+              <w:bottom w:w="120" w:type="dxa"/>
+              <w:right w:w="120" w:type="dxa"/>
+            </w:tcMar>
+          </w:tcPr>
+          <w:p>
+            <w:pPr>
+              <w:spacing w:after="200"/>
+            </w:pPr>
+            <w:r>
+              <w:rPr>
+                <w:b/>
+              </w:rPr>
+              <w:t>2. Look at two palms pressed together. Which surfaces touch? Palm and palm / palm and sleeve.</w:t>
+            </w:r>
+          </w:p>
+          <w:p>
+            <w:pPr>
+              <w:spacing w:after="1300"/>
+            </w:pPr>
+            <w:r>
+              <w:t xml:space="preserve"> </w:t>
+            </w:r>
+          </w:p>
+        </w:tc>
+      </w:tr>
+      <w:tr>
+        <w:tc>
+          <w:tcPr>
+            <w:tcW w:type="dxa" w:w="4933"/>
+            <w:vAlign w:val="top"/>
+            <w:tcBorders>
+              <w:top w:val="single" w:sz="5" w:color="D9D9D9"/>
+              <w:left w:val="single" w:sz="5" w:color="D9D9D9"/>
+              <w:bottom w:val="single" w:sz="5" w:color="D9D9D9"/>
+              <w:right w:val="single" w:sz="5" w:color="D9D9D9"/>
+            </w:tcBorders>
+            <w:tcMar>
+              <w:top w:w="120" w:type="dxa"/>
+              <w:left w:w="120" w:type="dxa"/>
+              <w:bottom w:w="120" w:type="dxa"/>
+              <w:right w:w="120" w:type="dxa"/>
+            </w:tcMar>
+          </w:tcPr>
+          <w:p>
+            <w:pPr>
+              <w:spacing w:after="200"/>
+            </w:pPr>
+            <w:r>
+              <w:rPr>
+                <w:b/>
+              </w:rPr>
+              <w:t>3. Use your chosen route. What do you notice when hands rub? Say, point or draw one observation.</w:t>
+            </w:r>
+          </w:p>
+          <w:p>
+            <w:pPr>
+              <w:spacing w:after="1300"/>
+            </w:pPr>
+            <w:r>
+              <w:t xml:space="preserve"> </w:t>
+            </w:r>
+          </w:p>
+        </w:tc>
+        <w:tc>
+          <w:tcPr>
+            <w:tcW w:type="dxa" w:w="4933"/>
+            <w:vAlign w:val="top"/>
+            <w:tcBorders>
+              <w:top w:val="single" w:sz="5" w:color="D9D9D9"/>
+              <w:left w:val="single" w:sz="5" w:color="D9D9D9"/>
+              <w:bottom w:val="single" w:sz="5" w:color="D9D9D9"/>
+              <w:right w:val="single" w:sz="5" w:color="D9D9D9"/>
+            </w:tcBorders>
+            <w:tcMar>
+              <w:top w:w="120" w:type="dxa"/>
+              <w:left w:w="120" w:type="dxa"/>
+              <w:bottom w:w="120" w:type="dxa"/>
+              <w:right w:w="120" w:type="dxa"/>
+            </w:tcMar>
+          </w:tcPr>
+          <w:p>
+            <w:pPr>
+              <w:spacing w:after="200"/>
+            </w:pPr>
+            <w:r>
+              <w:rPr>
+                <w:b/>
+              </w:rPr>
+              <w:t>4. A shoe needs to grip the ground. Does grip help walking or make slipping easier? Help walking / make slipping easier.</w:t>
+            </w:r>
+          </w:p>
+          <w:p>
+            <w:pPr>
+              <w:spacing w:after="1300"/>
+            </w:pPr>
+            <w:r>
+              <w:t xml:space="preserve"> </w:t>
+            </w:r>
+          </w:p>
+        </w:tc>
+      </w:tr>
+    </w:tbl>
+    <w:p>
+      <w:r>
+        <w:t>Choose one response route. An adult can read or scribe your words.</w:t>
+      </w:r>
+    </w:p>
+    <w:p>
+      <w:pPr>
+        <w:pStyle w:val="Kicker"/>
+        <w:pageBreakBefore/>
+      </w:pPr>
+      <w:r>
+        <w:t>ARRIVAL / STANDARD</w:t>
+      </w:r>
+    </w:p>
+    <w:p>
+      <w:pPr>
+        <w:pStyle w:val="Title"/>
+      </w:pPr>
+      <w:r>
+        <w:t>Friction arrival</w:t>
+      </w:r>
+    </w:p>
+    <w:p>
+      <w:r>
+        <w:t>Standard · Four minutes within Lesson A</w:t>
+      </w:r>
+    </w:p>
+    <w:p>
+      <w:r>
+        <w:t>Choose one route. Point, say, sign, draw or write. You may pass or say not sure. Use screen or paper; you do not need to do both.</w:t>
+      </w:r>
+    </w:p>
+    <w:p>
+      <w:r>
+        <w:t>For question 3, hand rubbing is optional. If comfortable, gently rub your hands for up to five seconds; stop at discomfort. You can watch an adult or describe a familiar hand-rubbing example instead. Say whether you observed it, remembered it or predicted it.</w:t>
+      </w:r>
+    </w:p>
+    <w:tbl>
+      <w:tblPr>
+        <w:tblW w:type="auto" w:w="0"/>
+        <w:tblLayout w:type="fixed"/>
+        <w:tblLook w:firstColumn="1" w:firstRow="1" w:lastColumn="0" w:lastRow="0" w:noHBand="0" w:noVBand="1" w:val="04A0"/>
+      </w:tblPr>
+      <w:tblGrid>
+        <w:gridCol w:w="4933"/>
+        <w:gridCol w:w="4933"/>
+      </w:tblGrid>
+      <w:tr>
+        <w:tc>
+          <w:tcPr>
+            <w:tcW w:type="dxa" w:w="4933"/>
+            <w:vAlign w:val="top"/>
+            <w:tcBorders>
+              <w:top w:val="single" w:sz="5" w:color="D9D9D9"/>
+              <w:left w:val="single" w:sz="5" w:color="D9D9D9"/>
+              <w:bottom w:val="single" w:sz="5" w:color="D9D9D9"/>
+              <w:right w:val="single" w:sz="5" w:color="D9D9D9"/>
+            </w:tcBorders>
+            <w:tcMar>
+              <w:top w:w="120" w:type="dxa"/>
+              <w:left w:w="120" w:type="dxa"/>
+              <w:bottom w:w="120" w:type="dxa"/>
+              <w:right w:w="120" w:type="dxa"/>
+            </w:tcMar>
+          </w:tcPr>
+          <w:p>
+            <w:pPr>
+              <w:spacing w:after="200"/>
+            </w:pPr>
+            <w:r>
+              <w:rPr>
+                <w:b/>
+              </w:rPr>
+              <w:t>1. Name the two actions that can change how an object moves: p___ and p___.</w:t>
+            </w:r>
+          </w:p>
+          <w:p>
+            <w:pPr>
+              <w:spacing w:after="1300"/>
+            </w:pPr>
+            <w:r>
+              <w:t xml:space="preserve"> </w:t>
+            </w:r>
+          </w:p>
+        </w:tc>
+        <w:tc>
+          <w:tcPr>
+            <w:tcW w:type="dxa" w:w="4933"/>
+            <w:vAlign w:val="top"/>
+            <w:tcBorders>
+              <w:top w:val="single" w:sz="5" w:color="D9D9D9"/>
+              <w:left w:val="single" w:sz="5" w:color="D9D9D9"/>
+              <w:bottom w:val="single" w:sz="5" w:color="D9D9D9"/>
+              <w:right w:val="single" w:sz="5" w:color="D9D9D9"/>
+            </w:tcBorders>
+            <w:tcMar>
+              <w:top w:w="120" w:type="dxa"/>
+              <w:left w:w="120" w:type="dxa"/>
+              <w:bottom w:w="120" w:type="dxa"/>
+              <w:right w:w="120" w:type="dxa"/>
+            </w:tcMar>
+          </w:tcPr>
+          <w:p>
+            <w:pPr>
+              <w:spacing w:after="200"/>
+            </w:pPr>
+            <w:r>
+              <w:rPr>
+                <w:b/>
+              </w:rPr>
+              <w:t>2. When hands rub, name the two touching surfaces.</w:t>
+            </w:r>
+          </w:p>
+          <w:p>
+            <w:pPr>
+              <w:spacing w:after="1300"/>
+            </w:pPr>
+            <w:r>
+              <w:t xml:space="preserve"> </w:t>
+            </w:r>
+          </w:p>
+        </w:tc>
+      </w:tr>
+      <w:tr>
+        <w:tc>
+          <w:tcPr>
+            <w:tcW w:type="dxa" w:w="4933"/>
+            <w:vAlign w:val="top"/>
+            <w:tcBorders>
+              <w:top w:val="single" w:sz="5" w:color="D9D9D9"/>
+              <w:left w:val="single" w:sz="5" w:color="D9D9D9"/>
+              <w:bottom w:val="single" w:sz="5" w:color="D9D9D9"/>
+              <w:right w:val="single" w:sz="5" w:color="D9D9D9"/>
+            </w:tcBorders>
+            <w:tcMar>
+              <w:top w:w="120" w:type="dxa"/>
+              <w:left w:w="120" w:type="dxa"/>
+              <w:bottom w:w="120" w:type="dxa"/>
+              <w:right w:w="120" w:type="dxa"/>
+            </w:tcMar>
+          </w:tcPr>
+          <w:p>
+            <w:pPr>
+              <w:spacing w:after="200"/>
+            </w:pPr>
+            <w:r>
+              <w:rPr>
+                <w:b/>
+              </w:rPr>
+              <w:t>3. Use your chosen route. Describe one change you notice or already know. If you know the force's name, add it.</w:t>
+            </w:r>
+          </w:p>
+          <w:p>
+            <w:pPr>
+              <w:spacing w:after="1300"/>
+            </w:pPr>
+            <w:r>
+              <w:t xml:space="preserve"> </w:t>
+            </w:r>
+          </w:p>
+        </w:tc>
+        <w:tc>
+          <w:tcPr>
+            <w:tcW w:type="dxa" w:w="4933"/>
+            <w:vAlign w:val="top"/>
+            <w:tcBorders>
+              <w:top w:val="single" w:sz="5" w:color="D9D9D9"/>
+              <w:left w:val="single" w:sz="5" w:color="D9D9D9"/>
+              <w:bottom w:val="single" w:sz="5" w:color="D9D9D9"/>
+              <w:right w:val="single" w:sz="5" w:color="D9D9D9"/>
+            </w:tcBorders>
+            <w:tcMar>
+              <w:top w:w="120" w:type="dxa"/>
+              <w:left w:w="120" w:type="dxa"/>
+              <w:bottom w:w="120" w:type="dxa"/>
+              <w:right w:w="120" w:type="dxa"/>
+            </w:tcMar>
+          </w:tcPr>
+          <w:p>
+            <w:pPr>
+              <w:spacing w:after="200"/>
+            </w:pPr>
+            <w:r>
+              <w:rPr>
+                <w:b/>
+              </w:rPr>
+              <w:t>4. A bike brake pad presses on the wheel rim. Predict what happens to the turning wheel.</w:t>
+            </w:r>
+          </w:p>
+          <w:p>
+            <w:pPr>
+              <w:spacing w:after="1300"/>
+            </w:pPr>
+            <w:r>
+              <w:t xml:space="preserve"> </w:t>
+            </w:r>
+          </w:p>
+        </w:tc>
+      </w:tr>
+    </w:tbl>
+    <w:p>
+      <w:r>
+        <w:t>Choose one response route. An adult can read or scribe your words.</w:t>
+      </w:r>
+    </w:p>
+    <w:p>
+      <w:pPr>
+        <w:pStyle w:val="Kicker"/>
+        <w:pageBreakBefore/>
+      </w:pPr>
+      <w:r>
+        <w:t>ARRIVAL / STRETCH</w:t>
+      </w:r>
+    </w:p>
+    <w:p>
+      <w:pPr>
+        <w:pStyle w:val="Title"/>
+      </w:pPr>
+      <w:r>
+        <w:t>Friction arrival</w:t>
+      </w:r>
+    </w:p>
+    <w:p>
+      <w:r>
+        <w:t>Stretch · Four minutes within Lesson A</w:t>
+      </w:r>
+    </w:p>
+    <w:p>
+      <w:r>
+        <w:t>Choose one route. Point, say, sign, draw or write. You may pass or say not sure. Use screen or paper; you do not need to do both.</w:t>
+      </w:r>
+    </w:p>
+    <w:p>
+      <w:r>
+        <w:t>For question 3, hand rubbing is optional. If comfortable, gently rub your hands for up to five seconds; stop at discomfort. You can watch an adult or describe a familiar hand-rubbing example instead. Say whether you observed it, remembered it or predicted it.</w:t>
+      </w:r>
+    </w:p>
+    <w:tbl>
+      <w:tblPr>
+        <w:tblW w:type="auto" w:w="0"/>
+        <w:tblLayout w:type="fixed"/>
+        <w:tblLook w:firstColumn="1" w:firstRow="1" w:lastColumn="0" w:lastRow="0" w:noHBand="0" w:noVBand="1" w:val="04A0"/>
+      </w:tblPr>
+      <w:tblGrid>
+        <w:gridCol w:w="4933"/>
+        <w:gridCol w:w="4933"/>
+      </w:tblGrid>
+      <w:tr>
+        <w:tc>
+          <w:tcPr>
+            <w:tcW w:type="dxa" w:w="4933"/>
+            <w:vAlign w:val="top"/>
+            <w:tcBorders>
+              <w:top w:val="single" w:sz="5" w:color="D9D9D9"/>
+              <w:left w:val="single" w:sz="5" w:color="D9D9D9"/>
+              <w:bottom w:val="single" w:sz="5" w:color="D9D9D9"/>
+              <w:right w:val="single" w:sz="5" w:color="D9D9D9"/>
+            </w:tcBorders>
+            <w:tcMar>
+              <w:top w:w="120" w:type="dxa"/>
+              <w:left w:w="120" w:type="dxa"/>
+              <w:bottom w:w="120" w:type="dxa"/>
+              <w:right w:w="120" w:type="dxa"/>
+            </w:tcMar>
+          </w:tcPr>
+          <w:p>
+            <w:pPr>
+              <w:spacing w:after="200"/>
+            </w:pPr>
+            <w:r>
+              <w:rPr>
+                <w:b/>
+              </w:rPr>
+              <w:t>1. A toy car is pushed, then slows on a level floor. Name one force you think could slow it. Not sure is useful.</w:t>
+            </w:r>
+          </w:p>
+          <w:p>
+            <w:pPr>
+              <w:spacing w:after="1300"/>
+            </w:pPr>
+            <w:r>
+              <w:t xml:space="preserve"> </w:t>
+            </w:r>
+          </w:p>
+        </w:tc>
+        <w:tc>
+          <w:tcPr>
+            <w:tcW w:type="dxa" w:w="4933"/>
+            <w:vAlign w:val="top"/>
+            <w:tcBorders>
+              <w:top w:val="single" w:sz="5" w:color="D9D9D9"/>
+              <w:left w:val="single" w:sz="5" w:color="D9D9D9"/>
+              <w:bottom w:val="single" w:sz="5" w:color="D9D9D9"/>
+              <w:right w:val="single" w:sz="5" w:color="D9D9D9"/>
+            </w:tcBorders>
+            <w:tcMar>
+              <w:top w:w="120" w:type="dxa"/>
+              <w:left w:w="120" w:type="dxa"/>
+              <w:bottom w:w="120" w:type="dxa"/>
+              <w:right w:w="120" w:type="dxa"/>
+            </w:tcMar>
+          </w:tcPr>
+          <w:p>
+            <w:pPr>
+              <w:spacing w:after="200"/>
+            </w:pPr>
+            <w:r>
+              <w:rPr>
+                <w:b/>
+              </w:rPr>
+              <w:t>2. A hand grips a door handle. Name the touching surfaces and explain what the grip helps you do.</w:t>
+            </w:r>
+          </w:p>
+          <w:p>
+            <w:pPr>
+              <w:spacing w:after="1300"/>
+            </w:pPr>
+            <w:r>
+              <w:t xml:space="preserve"> </w:t>
+            </w:r>
+          </w:p>
+        </w:tc>
+      </w:tr>
+      <w:tr>
+        <w:tc>
+          <w:tcPr>
+            <w:tcW w:type="dxa" w:w="4933"/>
+            <w:vAlign w:val="top"/>
+            <w:tcBorders>
+              <w:top w:val="single" w:sz="5" w:color="D9D9D9"/>
+              <w:left w:val="single" w:sz="5" w:color="D9D9D9"/>
+              <w:bottom w:val="single" w:sz="5" w:color="D9D9D9"/>
+              <w:right w:val="single" w:sz="5" w:color="D9D9D9"/>
+            </w:tcBorders>
+            <w:tcMar>
+              <w:top w:w="120" w:type="dxa"/>
+              <w:left w:w="120" w:type="dxa"/>
+              <w:bottom w:w="120" w:type="dxa"/>
+              <w:right w:w="120" w:type="dxa"/>
+            </w:tcMar>
+          </w:tcPr>
+          <w:p>
+            <w:pPr>
+              <w:spacing w:after="200"/>
+            </w:pPr>
+            <w:r>
+              <w:rPr>
+                <w:b/>
+              </w:rPr>
+              <w:t>3. Use your chosen route. Suggest why rubbing hands may feel warmer. Give a prediction if you cannot observe it.</w:t>
+            </w:r>
+          </w:p>
+          <w:p>
+            <w:pPr>
+              <w:spacing w:after="1300"/>
+            </w:pPr>
+            <w:r>
+              <w:t xml:space="preserve"> </w:t>
+            </w:r>
+          </w:p>
+        </w:tc>
+        <w:tc>
+          <w:tcPr>
+            <w:tcW w:type="dxa" w:w="4933"/>
+            <w:vAlign w:val="top"/>
+            <w:tcBorders>
+              <w:top w:val="single" w:sz="5" w:color="D9D9D9"/>
+              <w:left w:val="single" w:sz="5" w:color="D9D9D9"/>
+              <w:bottom w:val="single" w:sz="5" w:color="D9D9D9"/>
+              <w:right w:val="single" w:sz="5" w:color="D9D9D9"/>
+            </w:tcBorders>
+            <w:tcMar>
+              <w:top w:w="120" w:type="dxa"/>
+              <w:left w:w="120" w:type="dxa"/>
+              <w:bottom w:w="120" w:type="dxa"/>
+              <w:right w:w="120" w:type="dxa"/>
+            </w:tcMar>
+          </w:tcPr>
+          <w:p>
+            <w:pPr>
+              <w:spacing w:after="200"/>
+            </w:pPr>
+            <w:r>
+              <w:rPr>
+                <w:b/>
+              </w:rPr>
+              <w:t>4. Two toy cars start at different speeds on different surfaces. Is that a fair surface comparison? Name one thing to keep the same.</w:t>
+            </w:r>
+          </w:p>
+          <w:p>
+            <w:pPr>
+              <w:spacing w:after="1300"/>
+            </w:pPr>
+            <w:r>
+              <w:t xml:space="preserve"> </w:t>
+            </w:r>
+          </w:p>
+        </w:tc>
+      </w:tr>
+    </w:tbl>
+    <w:p>
+      <w:r>
+        <w:t>Choose one response route. An adult can read or scribe your words.</w:t>
+      </w:r>
+    </w:p>
     <w:sectPr>
       <w:headerReference w:type="default" r:id="rId9"/>
       <w:footerReference w:type="default" r:id="rId10"/>

</xml_diff>

<commit_message>
EDU-Q1: add W3A Friction organiser and two-check exit draft
</commit_message>
<xml_diff>
--- a/Science_Teesside/Teaching_Packs/GROW/lessons/W3A/GROW_W3A_Friction_Pupil.docx
+++ b/Science_Teesside/Teaching_Packs/GROW/lessons/W3A/GROW_W3A_Friction_Pupil.docx
@@ -3285,6 +3285,730 @@
         <w:t>Choose one response route. An adult can read or scribe your words.</w:t>
       </w:r>
     </w:p>
+    <w:p>
+      <w:pPr>
+        <w:pStyle w:val="Kicker"/>
+        <w:pageBreakBefore/>
+      </w:pPr>
+      <w:r>
+        <w:t>KEEP NEARBY / KNOWLEDGE ORGANISER</w:t>
+      </w:r>
+    </w:p>
+    <w:p>
+      <w:pPr>
+        <w:pStyle w:val="Title"/>
+      </w:pPr>
+      <w:r>
+        <w:t>Friction knowledge organiser</w:t>
+      </w:r>
+    </w:p>
+    <w:p>
+      <w:r>
+        <w:t>Learning objective: Explain what friction does and give examples where it helps and where it hinders.</w:t>
+      </w:r>
+    </w:p>
+    <w:p>
+      <w:pPr>
+        <w:spacing w:after="80"/>
+      </w:pPr>
+      <w:r>
+        <w:rPr>
+          <w:sz w:val="20"/>
+        </w:rPr>
+        <w:t>Success: Name the two touching surfaces. Explain how friction helps or hinders the intended job. Use an observation or a clearly labelled model to support an idea.</w:t>
+      </w:r>
+    </w:p>
+    <w:tbl>
+      <w:tblPr>
+        <w:tblW w:type="auto" w:w="0"/>
+        <w:tblLayout w:type="fixed"/>
+        <w:tblLook w:firstColumn="1" w:firstRow="1" w:lastColumn="0" w:lastRow="0" w:noHBand="0" w:noVBand="1" w:val="04A0"/>
+      </w:tblPr>
+      <w:tblGrid>
+        <w:gridCol w:w="4933"/>
+        <w:gridCol w:w="4933"/>
+      </w:tblGrid>
+      <w:tr>
+        <w:tc>
+          <w:tcPr>
+            <w:tcW w:type="dxa" w:w="4933"/>
+            <w:tcBorders>
+              <w:top w:val="single" w:sz="5" w:color="D9D9D9"/>
+              <w:left w:val="single" w:sz="5" w:color="D9D9D9"/>
+              <w:bottom w:val="single" w:sz="5" w:color="D9D9D9"/>
+              <w:right w:val="single" w:sz="5" w:color="D9D9D9"/>
+            </w:tcBorders>
+          </w:tcPr>
+          <w:p>
+            <w:r>
+              <w:t>Word</w:t>
+            </w:r>
+          </w:p>
+        </w:tc>
+        <w:tc>
+          <w:tcPr>
+            <w:tcW w:type="dxa" w:w="4933"/>
+            <w:tcBorders>
+              <w:top w:val="single" w:sz="5" w:color="D9D9D9"/>
+              <w:left w:val="single" w:sz="5" w:color="D9D9D9"/>
+              <w:bottom w:val="single" w:sz="5" w:color="D9D9D9"/>
+              <w:right w:val="single" w:sz="5" w:color="D9D9D9"/>
+            </w:tcBorders>
+          </w:tcPr>
+          <w:p>
+            <w:r>
+              <w:t>Meaning</w:t>
+            </w:r>
+          </w:p>
+        </w:tc>
+      </w:tr>
+      <w:tr>
+        <w:tc>
+          <w:tcPr>
+            <w:tcW w:type="dxa" w:w="4933"/>
+            <w:tcBorders>
+              <w:top w:val="single" w:sz="5" w:color="D9D9D9"/>
+              <w:left w:val="single" w:sz="5" w:color="D9D9D9"/>
+              <w:bottom w:val="single" w:sz="5" w:color="D9D9D9"/>
+              <w:right w:val="single" w:sz="5" w:color="D9D9D9"/>
+            </w:tcBorders>
+          </w:tcPr>
+          <w:p>
+            <w:r>
+              <w:t>Friction</w:t>
+            </w:r>
+          </w:p>
+        </w:tc>
+        <w:tc>
+          <w:tcPr>
+            <w:tcW w:type="dxa" w:w="4933"/>
+            <w:tcBorders>
+              <w:top w:val="single" w:sz="5" w:color="D9D9D9"/>
+              <w:left w:val="single" w:sz="5" w:color="D9D9D9"/>
+              <w:bottom w:val="single" w:sz="5" w:color="D9D9D9"/>
+              <w:right w:val="single" w:sz="5" w:color="D9D9D9"/>
+            </w:tcBorders>
+          </w:tcPr>
+          <w:p>
+            <w:r>
+              <w:t>A force that resists sliding, or attempted sliding, between touching surfaces.</w:t>
+            </w:r>
+          </w:p>
+        </w:tc>
+      </w:tr>
+      <w:tr>
+        <w:tc>
+          <w:tcPr>
+            <w:tcW w:type="dxa" w:w="4933"/>
+            <w:tcBorders>
+              <w:top w:val="single" w:sz="5" w:color="D9D9D9"/>
+              <w:left w:val="single" w:sz="5" w:color="D9D9D9"/>
+              <w:bottom w:val="single" w:sz="5" w:color="D9D9D9"/>
+              <w:right w:val="single" w:sz="5" w:color="D9D9D9"/>
+            </w:tcBorders>
+          </w:tcPr>
+          <w:p>
+            <w:r>
+              <w:t>Surface</w:t>
+            </w:r>
+          </w:p>
+        </w:tc>
+        <w:tc>
+          <w:tcPr>
+            <w:tcW w:type="dxa" w:w="4933"/>
+            <w:tcBorders>
+              <w:top w:val="single" w:sz="5" w:color="D9D9D9"/>
+              <w:left w:val="single" w:sz="5" w:color="D9D9D9"/>
+              <w:bottom w:val="single" w:sz="5" w:color="D9D9D9"/>
+              <w:right w:val="single" w:sz="5" w:color="D9D9D9"/>
+            </w:tcBorders>
+          </w:tcPr>
+          <w:p>
+            <w:r>
+              <w:t>The outside face of an object where contact happens.</w:t>
+            </w:r>
+          </w:p>
+        </w:tc>
+      </w:tr>
+      <w:tr>
+        <w:tc>
+          <w:tcPr>
+            <w:tcW w:type="dxa" w:w="4933"/>
+            <w:tcBorders>
+              <w:top w:val="single" w:sz="5" w:color="D9D9D9"/>
+              <w:left w:val="single" w:sz="5" w:color="D9D9D9"/>
+              <w:bottom w:val="single" w:sz="5" w:color="D9D9D9"/>
+              <w:right w:val="single" w:sz="5" w:color="D9D9D9"/>
+            </w:tcBorders>
+          </w:tcPr>
+          <w:p>
+            <w:r>
+              <w:t>Grip</w:t>
+            </w:r>
+          </w:p>
+        </w:tc>
+        <w:tc>
+          <w:tcPr>
+            <w:tcW w:type="dxa" w:w="4933"/>
+            <w:tcBorders>
+              <w:top w:val="single" w:sz="5" w:color="D9D9D9"/>
+              <w:left w:val="single" w:sz="5" w:color="D9D9D9"/>
+              <w:bottom w:val="single" w:sz="5" w:color="D9D9D9"/>
+              <w:right w:val="single" w:sz="5" w:color="D9D9D9"/>
+            </w:tcBorders>
+          </w:tcPr>
+          <w:p>
+            <w:r>
+              <w:t>Friction that helps prevent slipping.</w:t>
+            </w:r>
+          </w:p>
+        </w:tc>
+      </w:tr>
+      <w:tr>
+        <w:tc>
+          <w:tcPr>
+            <w:tcW w:type="dxa" w:w="4933"/>
+            <w:tcBorders>
+              <w:top w:val="single" w:sz="5" w:color="D9D9D9"/>
+              <w:left w:val="single" w:sz="5" w:color="D9D9D9"/>
+              <w:bottom w:val="single" w:sz="5" w:color="D9D9D9"/>
+              <w:right w:val="single" w:sz="5" w:color="D9D9D9"/>
+            </w:tcBorders>
+          </w:tcPr>
+          <w:p>
+            <w:r>
+              <w:t>Wear</w:t>
+            </w:r>
+          </w:p>
+        </w:tc>
+        <w:tc>
+          <w:tcPr>
+            <w:tcW w:type="dxa" w:w="4933"/>
+            <w:tcBorders>
+              <w:top w:val="single" w:sz="5" w:color="D9D9D9"/>
+              <w:left w:val="single" w:sz="5" w:color="D9D9D9"/>
+              <w:bottom w:val="single" w:sz="5" w:color="D9D9D9"/>
+              <w:right w:val="single" w:sz="5" w:color="D9D9D9"/>
+            </w:tcBorders>
+          </w:tcPr>
+          <w:p>
+            <w:r>
+              <w:t>Damage caused by repeated rubbing.</w:t>
+            </w:r>
+          </w:p>
+        </w:tc>
+      </w:tr>
+      <w:tr>
+        <w:tc>
+          <w:tcPr>
+            <w:tcW w:type="dxa" w:w="4933"/>
+            <w:tcBorders>
+              <w:top w:val="single" w:sz="5" w:color="D9D9D9"/>
+              <w:left w:val="single" w:sz="5" w:color="D9D9D9"/>
+              <w:bottom w:val="single" w:sz="5" w:color="D9D9D9"/>
+              <w:right w:val="single" w:sz="5" w:color="D9D9D9"/>
+            </w:tcBorders>
+          </w:tcPr>
+          <w:p>
+            <w:r>
+              <w:t>Lubricant</w:t>
+            </w:r>
+          </w:p>
+        </w:tc>
+        <w:tc>
+          <w:tcPr>
+            <w:tcW w:type="dxa" w:w="4933"/>
+            <w:tcBorders>
+              <w:top w:val="single" w:sz="5" w:color="D9D9D9"/>
+              <w:left w:val="single" w:sz="5" w:color="D9D9D9"/>
+              <w:bottom w:val="single" w:sz="5" w:color="D9D9D9"/>
+              <w:right w:val="single" w:sz="5" w:color="D9D9D9"/>
+            </w:tcBorders>
+          </w:tcPr>
+          <w:p>
+            <w:r>
+              <w:t>A substance that can reduce friction in suitable contacts.</w:t>
+            </w:r>
+          </w:p>
+        </w:tc>
+      </w:tr>
+    </w:tbl>
+    <w:p>
+      <w:pPr>
+        <w:spacing w:after="80"/>
+      </w:pPr>
+      <w:r>
+        <w:rPr>
+          <w:sz w:val="20"/>
+        </w:rPr>
+        <w:t>Friction acts at a contact. Identify both surfaces and their relative sliding.</w:t>
+      </w:r>
+    </w:p>
+    <w:p>
+      <w:pPr>
+        <w:spacing w:after="80"/>
+      </w:pPr>
+      <w:r>
+        <w:rPr>
+          <w:sz w:val="20"/>
+        </w:rPr>
+        <w:t>The actual surface pair and its condition matter. Smooth rubber and smooth glass can still grip; roughness alone does not predict every result.</w:t>
+      </w:r>
+    </w:p>
+    <w:p>
+      <w:pPr>
+        <w:spacing w:after="80"/>
+      </w:pPr>
+      <w:r>
+        <w:rPr>
+          <w:sz w:val="20"/>
+        </w:rPr>
+        <w:t>Rubbing can transfer energy to thermal stores. A brief rub need not produce noticeable warmth.</w:t>
+      </w:r>
+    </w:p>
+    <w:p>
+      <w:pPr>
+        <w:spacing w:after="80"/>
+      </w:pPr>
+      <w:r>
+        <w:rPr>
+          <w:sz w:val="20"/>
+        </w:rPr>
+        <w:drawing>
+          <wp:inline xmlns:a="http://schemas.openxmlformats.org/drawingml/2006/main" xmlns:pic="http://schemas.openxmlformats.org/drawingml/2006/picture">
+            <wp:extent cx="5303520" cy="1441894"/>
+            <wp:docPr id="1" name="Picture 1"/>
+            <wp:cNvGraphicFramePr>
+              <a:graphicFrameLocks noChangeAspect="1"/>
+            </wp:cNvGraphicFramePr>
+            <a:graphic>
+              <a:graphicData uri="http://schemas.openxmlformats.org/drawingml/2006/picture">
+                <pic:pic>
+                  <pic:nvPicPr>
+                    <pic:cNvPr id="0" name="image.png"/>
+                    <pic:cNvPicPr/>
+                  </pic:nvPicPr>
+                  <pic:blipFill>
+                    <a:blip r:embed="rId11"/>
+                    <a:stretch>
+                      <a:fillRect/>
+                    </a:stretch>
+                  </pic:blipFill>
+                  <pic:spPr>
+                    <a:xfrm>
+                      <a:off x="0" y="0"/>
+                      <a:ext cx="5303520" cy="1441894"/>
+                    </a:xfrm>
+                    <a:prstGeom prst="rect"/>
+                  </pic:spPr>
+                </pic:pic>
+              </a:graphicData>
+            </a:graphic>
+          </wp:inline>
+        </w:drawing>
+      </w:r>
+    </w:p>
+    <w:p>
+      <w:pPr>
+        <w:spacing w:after="80"/>
+      </w:pPr>
+      <w:r>
+        <w:rPr>
+          <w:sz w:val="20"/>
+        </w:rPr>
+        <w:t>For a box sliding right on a floor, friction on the box acts left along the contact. This is an explanatory model, not a force measurement.</w:t>
+      </w:r>
+    </w:p>
+    <w:p>
+      <w:pPr>
+        <w:spacing w:after="80"/>
+      </w:pPr>
+      <w:r>
+        <w:rPr>
+          <w:sz w:val="20"/>
+        </w:rPr>
+        <w:t>Helpful: pad–wheel friction helps a bike brake slow the wheel.</w:t>
+      </w:r>
+    </w:p>
+    <w:p>
+      <w:pPr>
+        <w:spacing w:after="80"/>
+      </w:pPr>
+      <w:r>
+        <w:rPr>
+          <w:sz w:val="20"/>
+        </w:rPr>
+        <w:t>Unhelpful: rubbing between moving engine parts can cause unwanted heating and wear.</w:t>
+      </w:r>
+    </w:p>
+    <w:p>
+      <w:pPr>
+        <w:spacing w:after="80"/>
+      </w:pPr>
+      <w:r>
+        <w:rPr>
+          <w:sz w:val="20"/>
+        </w:rPr>
+        <w:t>Use evidence: Compare surfaces using the same block, fixed ramp and release point, no push, and the same measuring start. Repeat a run. Record what actually happened; label supplied results as model data.</w:t>
+      </w:r>
+    </w:p>
+    <w:p>
+      <w:pPr>
+        <w:pStyle w:val="Kicker"/>
+        <w:pageBreakBefore/>
+      </w:pPr>
+      <w:r>
+        <w:t>CHOOSE ONE ROUTE / TWO COPIES TO CUT</w:t>
+      </w:r>
+    </w:p>
+    <w:p>
+      <w:pPr>
+        <w:pStyle w:val="Title"/>
+      </w:pPr>
+      <w:r>
+        <w:t>Friction exit Supported</w:t>
+      </w:r>
+    </w:p>
+    <w:p>
+      <w:pPr>
+        <w:pStyle w:val="Heading1"/>
+      </w:pPr>
+      <w:r>
+        <w:t>Lesson A · Supported</w:t>
+      </w:r>
+    </w:p>
+    <w:p>
+      <w:r>
+        <w:t>Two small checks to finish Lesson A. Point, say, sign, draw, type or use paper. An adult can scribe your words. You may pass; complete one route, once.</w:t>
+      </w:r>
+    </w:p>
+    <w:p>
+      <w:r>
+        <w:rPr>
+          <w:b/>
+        </w:rPr>
+        <w:t>1. A box slides right on a floor. Which way does friction on the box act?</w:t>
+      </w:r>
+    </w:p>
+    <w:p>
+      <w:r>
+        <w:t>Left / Right</w:t>
+      </w:r>
+    </w:p>
+    <w:p>
+      <w:r>
+        <w:rPr>
+          <w:b/>
+        </w:rPr>
+        <w:t>2. Bike brake pads rub on the wheel rim. Does this help slow the wheel?</w:t>
+      </w:r>
+    </w:p>
+    <w:p>
+      <w:r>
+        <w:t>Yes / No</w:t>
+      </w:r>
+    </w:p>
+    <w:p>
+      <w:pPr>
+        <w:spacing w:after="360"/>
+      </w:pPr>
+      <w:r>
+        <w:t>Next lesson: Friction: test the surfaces</w:t>
+      </w:r>
+    </w:p>
+    <w:p>
+      <w:pPr>
+        <w:pStyle w:val="Heading1"/>
+      </w:pPr>
+      <w:r>
+        <w:t>Lesson A · Supported</w:t>
+      </w:r>
+    </w:p>
+    <w:p>
+      <w:r>
+        <w:t>Two small checks to finish Lesson A. Point, say, sign, draw, type or use paper. An adult can scribe your words. You may pass; complete one route, once.</w:t>
+      </w:r>
+    </w:p>
+    <w:p>
+      <w:r>
+        <w:rPr>
+          <w:b/>
+        </w:rPr>
+        <w:t>1. A box slides right on a floor. Which way does friction on the box act?</w:t>
+      </w:r>
+    </w:p>
+    <w:p>
+      <w:r>
+        <w:t>Left / Right</w:t>
+      </w:r>
+    </w:p>
+    <w:p>
+      <w:r>
+        <w:rPr>
+          <w:b/>
+        </w:rPr>
+        <w:t>2. Bike brake pads rub on the wheel rim. Does this help slow the wheel?</w:t>
+      </w:r>
+    </w:p>
+    <w:p>
+      <w:r>
+        <w:t>Yes / No</w:t>
+      </w:r>
+    </w:p>
+    <w:p>
+      <w:pPr>
+        <w:spacing w:after="360"/>
+      </w:pPr>
+      <w:r>
+        <w:t>Next lesson: Friction: test the surfaces</w:t>
+      </w:r>
+    </w:p>
+    <w:p>
+      <w:pPr>
+        <w:pStyle w:val="Kicker"/>
+        <w:pageBreakBefore/>
+      </w:pPr>
+      <w:r>
+        <w:t>CHOOSE ONE ROUTE / TWO COPIES TO CUT</w:t>
+      </w:r>
+    </w:p>
+    <w:p>
+      <w:pPr>
+        <w:pStyle w:val="Title"/>
+      </w:pPr>
+      <w:r>
+        <w:t>Friction exit Standard</w:t>
+      </w:r>
+    </w:p>
+    <w:p>
+      <w:pPr>
+        <w:pStyle w:val="Heading1"/>
+      </w:pPr>
+      <w:r>
+        <w:t>Lesson A · Standard</w:t>
+      </w:r>
+    </w:p>
+    <w:p>
+      <w:r>
+        <w:t>Two small checks to finish Lesson A. Point, say, sign, draw, type or use paper. An adult can scribe your words. You may pass; complete one route, once.</w:t>
+      </w:r>
+    </w:p>
+    <w:p>
+      <w:r>
+        <w:rPr>
+          <w:b/>
+        </w:rPr>
+        <w:t>1. Friction acts between touching ____ and resists their sliding.</w:t>
+      </w:r>
+    </w:p>
+    <w:p>
+      <w:pPr>
+        <w:spacing w:after="400"/>
+      </w:pPr>
+      <w:r>
+        <w:t xml:space="preserve"> </w:t>
+      </w:r>
+    </w:p>
+    <w:p>
+      <w:r>
+        <w:rPr>
+          <w:b/>
+        </w:rPr>
+        <w:t>2. Friction at the brake pad helps the wheel ____.</w:t>
+      </w:r>
+    </w:p>
+    <w:p>
+      <w:pPr>
+        <w:spacing w:after="400"/>
+      </w:pPr>
+      <w:r>
+        <w:t xml:space="preserve"> </w:t>
+      </w:r>
+    </w:p>
+    <w:p>
+      <w:pPr>
+        <w:spacing w:after="360"/>
+      </w:pPr>
+      <w:r>
+        <w:t>Next lesson: Friction: test the surfaces</w:t>
+      </w:r>
+    </w:p>
+    <w:p>
+      <w:pPr>
+        <w:pStyle w:val="Heading1"/>
+      </w:pPr>
+      <w:r>
+        <w:t>Lesson A · Standard</w:t>
+      </w:r>
+    </w:p>
+    <w:p>
+      <w:r>
+        <w:t>Two small checks to finish Lesson A. Point, say, sign, draw, type or use paper. An adult can scribe your words. You may pass; complete one route, once.</w:t>
+      </w:r>
+    </w:p>
+    <w:p>
+      <w:r>
+        <w:rPr>
+          <w:b/>
+        </w:rPr>
+        <w:t>1. Friction acts between touching ____ and resists their sliding.</w:t>
+      </w:r>
+    </w:p>
+    <w:p>
+      <w:pPr>
+        <w:spacing w:after="400"/>
+      </w:pPr>
+      <w:r>
+        <w:t xml:space="preserve"> </w:t>
+      </w:r>
+    </w:p>
+    <w:p>
+      <w:r>
+        <w:rPr>
+          <w:b/>
+        </w:rPr>
+        <w:t>2. Friction at the brake pad helps the wheel ____.</w:t>
+      </w:r>
+    </w:p>
+    <w:p>
+      <w:pPr>
+        <w:spacing w:after="400"/>
+      </w:pPr>
+      <w:r>
+        <w:t xml:space="preserve"> </w:t>
+      </w:r>
+    </w:p>
+    <w:p>
+      <w:pPr>
+        <w:spacing w:after="360"/>
+      </w:pPr>
+      <w:r>
+        <w:t>Next lesson: Friction: test the surfaces</w:t>
+      </w:r>
+    </w:p>
+    <w:p>
+      <w:pPr>
+        <w:pStyle w:val="Kicker"/>
+        <w:pageBreakBefore/>
+      </w:pPr>
+      <w:r>
+        <w:t>CHOOSE ONE ROUTE / TWO COPIES TO CUT</w:t>
+      </w:r>
+    </w:p>
+    <w:p>
+      <w:pPr>
+        <w:pStyle w:val="Title"/>
+      </w:pPr>
+      <w:r>
+        <w:t>Friction exit Stretch</w:t>
+      </w:r>
+    </w:p>
+    <w:p>
+      <w:pPr>
+        <w:pStyle w:val="Heading1"/>
+      </w:pPr>
+      <w:r>
+        <w:t>Lesson A · Stretch</w:t>
+      </w:r>
+    </w:p>
+    <w:p>
+      <w:r>
+        <w:t>Two small checks to finish Lesson A. Point, say, sign, draw, type or use paper. An adult can scribe your words. You may pass; complete one route, once.</w:t>
+      </w:r>
+    </w:p>
+    <w:p>
+      <w:r>
+        <w:rPr>
+          <w:b/>
+        </w:rPr>
+        <w:t>1. Friction at a bike brake is helpful because ____.</w:t>
+      </w:r>
+    </w:p>
+    <w:p>
+      <w:pPr>
+        <w:spacing w:after="400"/>
+      </w:pPr>
+      <w:r>
+        <w:t xml:space="preserve"> </w:t>
+      </w:r>
+    </w:p>
+    <w:p>
+      <w:r>
+        <w:rPr>
+          <w:b/>
+        </w:rPr>
+        <w:t>2. Friction between moving engine parts can be unhelpful because ____.</w:t>
+      </w:r>
+    </w:p>
+    <w:p>
+      <w:pPr>
+        <w:spacing w:after="400"/>
+      </w:pPr>
+      <w:r>
+        <w:t xml:space="preserve"> </w:t>
+      </w:r>
+    </w:p>
+    <w:p>
+      <w:pPr>
+        <w:spacing w:after="360"/>
+      </w:pPr>
+      <w:r>
+        <w:t>Next lesson: Friction: test the surfaces</w:t>
+      </w:r>
+    </w:p>
+    <w:p>
+      <w:pPr>
+        <w:pStyle w:val="Heading1"/>
+      </w:pPr>
+      <w:r>
+        <w:t>Lesson A · Stretch</w:t>
+      </w:r>
+    </w:p>
+    <w:p>
+      <w:r>
+        <w:t>Two small checks to finish Lesson A. Point, say, sign, draw, type or use paper. An adult can scribe your words. You may pass; complete one route, once.</w:t>
+      </w:r>
+    </w:p>
+    <w:p>
+      <w:r>
+        <w:rPr>
+          <w:b/>
+        </w:rPr>
+        <w:t>1. Friction at a bike brake is helpful because ____.</w:t>
+      </w:r>
+    </w:p>
+    <w:p>
+      <w:pPr>
+        <w:spacing w:after="400"/>
+      </w:pPr>
+      <w:r>
+        <w:t xml:space="preserve"> </w:t>
+      </w:r>
+    </w:p>
+    <w:p>
+      <w:r>
+        <w:rPr>
+          <w:b/>
+        </w:rPr>
+        <w:t>2. Friction between moving engine parts can be unhelpful because ____.</w:t>
+      </w:r>
+    </w:p>
+    <w:p>
+      <w:pPr>
+        <w:spacing w:after="400"/>
+      </w:pPr>
+      <w:r>
+        <w:t xml:space="preserve"> </w:t>
+      </w:r>
+    </w:p>
+    <w:p>
+      <w:pPr>
+        <w:spacing w:after="360"/>
+      </w:pPr>
+      <w:r>
+        <w:t>Next lesson: Friction: test the surfaces</w:t>
+      </w:r>
+    </w:p>
     <w:sectPr>
       <w:headerReference w:type="default" r:id="rId9"/>
       <w:footerReference w:type="default" r:id="rId10"/>

</xml_diff>

<commit_message>
EDU-Q1: integrate optional Friction feedback guidance
</commit_message>
<xml_diff>
--- a/Science_Teesside/Teaching_Packs/GROW/lessons/W3A/GROW_W3A_Friction_Pupil.docx
+++ b/Science_Teesside/Teaching_Packs/GROW/lessons/W3A/GROW_W3A_Friction_Pupil.docx
@@ -28,7 +28,7 @@
         <w:pStyle w:val="Subtitle"/>
       </w:pPr>
       <w:r>
-        <w:t>Week 3 · Lesson A · Monday · 40 minutes</w:t>
+        <w:t>Week 3 · Lesson A · 40 minutes</w:t>
       </w:r>
     </w:p>
     <w:p>
@@ -1121,7 +1121,7 @@
         <w:pStyle w:val="Small"/>
       </w:pPr>
       <w:r>
-        <w:t>Keep the decision tied to the contact and the job. No oil is needed for this activity.</w:t>
+        <w:t>Keep the decision tied to the contact and the job. No oil is needed. Optional: During the claim sort, point, say, sign or show the adult an idea, question or change that would help. You may pass or speak privately. The adult listens, explains what can change and checks whether it helped.</w:t>
       </w:r>
     </w:p>
     <w:p>
@@ -1359,7 +1359,7 @@
         </w:pBdr>
       </w:pPr>
       <w:r>
-        <w:t>STOP after the shared claim sort. Put your name on your work and keep it for Tuesday. Your prediction comes with you.</w:t>
+        <w:t>Finish one two-check exit route, then stop and keep your work. Next lesson: Friction: test the surfaces.</w:t>
       </w:r>
     </w:p>
     <w:p>
@@ -1593,7 +1593,7 @@
         </w:pBdr>
       </w:pPr>
       <w:r>
-        <w:t>STOP after the shared claim sort. Label and keep your work for Tuesday. Keep your surface prediction; do not claim a test you did not perform.</w:t>
+        <w:t>Finish one two-check exit route, then stop and keep your work. Next lesson: Friction: test the surfaces.</w:t>
       </w:r>
     </w:p>
     <w:p>
@@ -1830,7 +1830,7 @@
         </w:pBdr>
       </w:pPr>
       <w:r>
-        <w:t>STOP after the shared claim sort. Label and keep your work for Tuesday. Your next lesson tests surfaces; today’s reasoning is not a completed investigation.</w:t>
+        <w:t>Finish one two-check exit route, then stop and keep your work. Next lesson: Friction: test the surfaces.</w:t>
       </w:r>
     </w:p>
     <w:p>

</xml_diff>